<commit_message>
Task 2; Proposal Overview
</commit_message>
<xml_diff>
--- a/Capstone Report/Capstone Task 3 Report.docx
+++ b/Capstone Report/Capstone Task 3 Report.docx
@@ -256,6 +256,7 @@
           <w:bCs/>
           <w:noProof/>
         </w:rPr>
+        <w:lastRenderedPageBreak/>
         <w:br w:type="page"/>
       </w:r>
     </w:p>
@@ -1510,6 +1511,7 @@
           <w:sz w:val="24"/>
           <w:szCs w:val="24"/>
         </w:rPr>
+        <w:lastRenderedPageBreak/>
         <w:t>Task 3 is a</w:t>
       </w:r>
       <w:r>
@@ -2101,6 +2103,7 @@
           <w:sz w:val="24"/>
           <w:szCs w:val="24"/>
         </w:rPr>
+        <w:lastRenderedPageBreak/>
         <w:t>The “given” elements to summari</w:t>
       </w:r>
       <w:r>
@@ -2825,6 +2828,7 @@
       </w:pPr>
       <w:bookmarkStart w:id="2" w:name="_Toc1191971028"/>
       <w:r>
+        <w:lastRenderedPageBreak/>
         <w:t xml:space="preserve">C. </w:t>
       </w:r>
       <w:r>
@@ -3432,6 +3436,7 @@
       <w:bookmarkStart w:id="5" w:name="_Toc512824111"/>
       <w:bookmarkEnd w:id="4"/>
       <w:r>
+        <w:lastRenderedPageBreak/>
         <w:t xml:space="preserve">D. </w:t>
       </w:r>
       <w:r>
@@ -4014,6 +4019,7 @@
       </w:pPr>
       <w:bookmarkStart w:id="9" w:name="_Toc825242289"/>
       <w:r>
+        <w:lastRenderedPageBreak/>
         <w:t>E</w:t>
       </w:r>
       <w:r>
@@ -4725,6 +4731,7 @@
           <w:sz w:val="24"/>
           <w:szCs w:val="24"/>
         </w:rPr>
+        <w:lastRenderedPageBreak/>
         <w:t xml:space="preserve">The algorithm(s) </w:t>
       </w:r>
       <w:r>
@@ -5157,6 +5164,7 @@
       </w:pPr>
       <w:bookmarkStart w:id="15" w:name="_Toc1495356842"/>
       <w:r>
+        <w:lastRenderedPageBreak/>
         <w:t>G. Conclusion</w:t>
       </w:r>
       <w:bookmarkEnd w:id="15"/>
@@ -5814,6 +5822,7 @@
           <w:sz w:val="24"/>
           <w:szCs w:val="24"/>
         </w:rPr>
+        <w:lastRenderedPageBreak/>
         <w:t xml:space="preserve">Provide a link to your Panopto video. </w:t>
       </w:r>
     </w:p>
@@ -6390,6 +6399,7 @@
       <w:bookmarkStart w:id="24" w:name="_Toc1695981861"/>
       <w:bookmarkEnd w:id="23"/>
       <w:r>
+        <w:lastRenderedPageBreak/>
         <w:t>Appendix A</w:t>
       </w:r>
       <w:bookmarkEnd w:id="24"/>
@@ -6433,6 +6443,7 @@
       <w:bookmarkStart w:id="28" w:name="_Toc1686431257"/>
       <w:bookmarkEnd w:id="27"/>
       <w:r>
+        <w:lastRenderedPageBreak/>
         <w:t>Appendix B</w:t>
       </w:r>
       <w:bookmarkEnd w:id="28"/>
@@ -6480,6 +6491,7 @@
       <w:bookmarkStart w:id="32" w:name="_Toc1371871733"/>
       <w:bookmarkEnd w:id="31"/>
       <w:r>
+        <w:lastRenderedPageBreak/>
         <w:t>Appendix C</w:t>
       </w:r>
       <w:bookmarkEnd w:id="32"/>
@@ -6527,6 +6539,7 @@
       <w:bookmarkStart w:id="36" w:name="_Toc724305577"/>
       <w:bookmarkEnd w:id="35"/>
       <w:r>
+        <w:lastRenderedPageBreak/>
         <w:t>Appendix D</w:t>
       </w:r>
       <w:bookmarkEnd w:id="36"/>
@@ -12967,18 +12980,15 @@
 </file>
 
 <file path=customXml/item2.xml><?xml version="1.0" encoding="utf-8"?>
-<go:gDocsCustomXmlDataStorage xmlns:go="http://customooxmlschemas.google.com/" xmlns:r="http://schemas.openxmlformats.org/officeDocument/2006/relationships">
-  <go:docsCustomData xmlns:go="http://customooxmlschemas.google.com/" roundtripDataSignature="AMtx7mi9hMm1w2n+Vt6hN/m6X//z+ToJ7Q==">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</go:docsCustomData>
-</go:gDocsCustomXmlDataStorage>
+<?mso-contentType ?>
+<FormTemplates xmlns="http://schemas.microsoft.com/sharepoint/v3/contenttype/forms">
+  <Display>DocumentLibraryForm</Display>
+  <Edit>DocumentLibraryForm</Edit>
+  <New>DocumentLibraryForm</New>
+</FormTemplates>
 </file>
 
 <file path=customXml/item3.xml><?xml version="1.0" encoding="utf-8"?>
-<p:properties xmlns:p="http://schemas.microsoft.com/office/2006/metadata/properties" xmlns:xsi="http://www.w3.org/2001/XMLSchema-instance" xmlns:pc="http://schemas.microsoft.com/office/infopath/2007/PartnerControls">
-  <documentManagement/>
-</p:properties>
-</file>
-
-<file path=customXml/item4.xml><?xml version="1.0" encoding="utf-8"?>
 <b:Sources xmlns:b="http://schemas.openxmlformats.org/officeDocument/2006/bibliography" xmlns="http://schemas.openxmlformats.org/officeDocument/2006/bibliography" SelectedStyle="\APASixthEditionOfficeOnline.xsl" StyleName="APA" Version="6">
   <b:Source>
     <b:Tag>Smi23</b:Tag>
@@ -13034,13 +13044,16 @@
 </b:Sources>
 </file>
 
+<file path=customXml/item4.xml><?xml version="1.0" encoding="utf-8"?>
+<p:properties xmlns:p="http://schemas.microsoft.com/office/2006/metadata/properties" xmlns:xsi="http://www.w3.org/2001/XMLSchema-instance" xmlns:pc="http://schemas.microsoft.com/office/infopath/2007/PartnerControls">
+  <documentManagement/>
+</p:properties>
+</file>
+
 <file path=customXml/item5.xml><?xml version="1.0" encoding="utf-8"?>
-<?mso-contentType ?>
-<FormTemplates xmlns="http://schemas.microsoft.com/sharepoint/v3/contenttype/forms">
-  <Display>DocumentLibraryForm</Display>
-  <Edit>DocumentLibraryForm</Edit>
-  <New>DocumentLibraryForm</New>
-</FormTemplates>
+<go:gDocsCustomXmlDataStorage xmlns:go="http://customooxmlschemas.google.com/" xmlns:r="http://schemas.openxmlformats.org/officeDocument/2006/relationships">
+  <go:docsCustomData xmlns:go="http://customooxmlschemas.google.com/" roundtripDataSignature="AMtx7mi9hMm1w2n+Vt6hN/m6X//z+ToJ7Q==">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</go:docsCustomData>
+</go:gDocsCustomXmlDataStorage>
 </file>
 
 <file path=customXml/itemProps1.xml><?xml version="1.0" encoding="utf-8"?>
@@ -13062,15 +13075,22 @@
 </file>
 
 <file path=customXml/itemProps2.xml><?xml version="1.0" encoding="utf-8"?>
-<ds:datastoreItem xmlns:ds="http://schemas.openxmlformats.org/officeDocument/2006/customXml" ds:itemID="{11111111-1234-1234-1234-123412341234}">
+<ds:datastoreItem xmlns:ds="http://schemas.openxmlformats.org/officeDocument/2006/customXml" ds:itemID="{C680D73B-91EB-444F-9F20-EA16FB22928D}">
   <ds:schemaRefs>
-    <ds:schemaRef ds:uri="http://customooxmlschemas.google.com/"/>
-    <ds:schemaRef ds:uri="http://schemas.openxmlformats.org/officeDocument/2006/relationships"/>
+    <ds:schemaRef ds:uri="http://schemas.microsoft.com/sharepoint/v3/contenttype/forms"/>
   </ds:schemaRefs>
 </ds:datastoreItem>
 </file>
 
 <file path=customXml/itemProps3.xml><?xml version="1.0" encoding="utf-8"?>
+<ds:datastoreItem xmlns:ds="http://schemas.openxmlformats.org/officeDocument/2006/customXml" ds:itemID="{119407D8-7FC4-47F1-85AD-0300064F059B}">
+  <ds:schemaRefs>
+    <ds:schemaRef ds:uri="http://schemas.openxmlformats.org/officeDocument/2006/bibliography"/>
+  </ds:schemaRefs>
+</ds:datastoreItem>
+</file>
+
+<file path=customXml/itemProps4.xml><?xml version="1.0" encoding="utf-8"?>
 <ds:datastoreItem xmlns:ds="http://schemas.openxmlformats.org/officeDocument/2006/customXml" ds:itemID="{6567523E-179E-43C2-932B-A043724ECE49}">
   <ds:schemaRefs>
     <ds:schemaRef ds:uri="http://schemas.microsoft.com/office/2006/metadata/properties"/>
@@ -13079,18 +13099,11 @@
 </ds:datastoreItem>
 </file>
 
-<file path=customXml/itemProps4.xml><?xml version="1.0" encoding="utf-8"?>
-<ds:datastoreItem xmlns:ds="http://schemas.openxmlformats.org/officeDocument/2006/customXml" ds:itemID="{119407D8-7FC4-47F1-85AD-0300064F059B}">
+<file path=customXml/itemProps5.xml><?xml version="1.0" encoding="utf-8"?>
+<ds:datastoreItem xmlns:ds="http://schemas.openxmlformats.org/officeDocument/2006/customXml" ds:itemID="{11111111-1234-1234-1234-123412341234}">
   <ds:schemaRefs>
-    <ds:schemaRef ds:uri="http://schemas.openxmlformats.org/officeDocument/2006/bibliography"/>
-  </ds:schemaRefs>
-</ds:datastoreItem>
-</file>
-
-<file path=customXml/itemProps5.xml><?xml version="1.0" encoding="utf-8"?>
-<ds:datastoreItem xmlns:ds="http://schemas.openxmlformats.org/officeDocument/2006/customXml" ds:itemID="{C680D73B-91EB-444F-9F20-EA16FB22928D}">
-  <ds:schemaRefs>
-    <ds:schemaRef ds:uri="http://schemas.microsoft.com/sharepoint/v3/contenttype/forms"/>
+    <ds:schemaRef ds:uri="http://customooxmlschemas.google.com/"/>
+    <ds:schemaRef ds:uri="http://schemas.openxmlformats.org/officeDocument/2006/relationships"/>
   </ds:schemaRefs>
 </ds:datastoreItem>
 </file>

</xml_diff>

<commit_message>
New folder added with charts
</commit_message>
<xml_diff>
--- a/Capstone Report/Capstone Task 3 Report.docx
+++ b/Capstone Report/Capstone Task 3 Report.docx
@@ -12980,15 +12980,18 @@
 </file>
 
 <file path=customXml/item2.xml><?xml version="1.0" encoding="utf-8"?>
-<?mso-contentType ?>
-<FormTemplates xmlns="http://schemas.microsoft.com/sharepoint/v3/contenttype/forms">
-  <Display>DocumentLibraryForm</Display>
-  <Edit>DocumentLibraryForm</Edit>
-  <New>DocumentLibraryForm</New>
-</FormTemplates>
+<go:gDocsCustomXmlDataStorage xmlns:go="http://customooxmlschemas.google.com/" xmlns:r="http://schemas.openxmlformats.org/officeDocument/2006/relationships">
+  <go:docsCustomData xmlns:go="http://customooxmlschemas.google.com/" roundtripDataSignature="AMtx7mi9hMm1w2n+Vt6hN/m6X//z+ToJ7Q==">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</go:docsCustomData>
+</go:gDocsCustomXmlDataStorage>
 </file>
 
 <file path=customXml/item3.xml><?xml version="1.0" encoding="utf-8"?>
+<p:properties xmlns:p="http://schemas.microsoft.com/office/2006/metadata/properties" xmlns:xsi="http://www.w3.org/2001/XMLSchema-instance" xmlns:pc="http://schemas.microsoft.com/office/infopath/2007/PartnerControls">
+  <documentManagement/>
+</p:properties>
+</file>
+
+<file path=customXml/item4.xml><?xml version="1.0" encoding="utf-8"?>
 <b:Sources xmlns:b="http://schemas.openxmlformats.org/officeDocument/2006/bibliography" xmlns="http://schemas.openxmlformats.org/officeDocument/2006/bibliography" SelectedStyle="\APASixthEditionOfficeOnline.xsl" StyleName="APA" Version="6">
   <b:Source>
     <b:Tag>Smi23</b:Tag>
@@ -13044,16 +13047,13 @@
 </b:Sources>
 </file>
 
-<file path=customXml/item4.xml><?xml version="1.0" encoding="utf-8"?>
-<p:properties xmlns:p="http://schemas.microsoft.com/office/2006/metadata/properties" xmlns:xsi="http://www.w3.org/2001/XMLSchema-instance" xmlns:pc="http://schemas.microsoft.com/office/infopath/2007/PartnerControls">
-  <documentManagement/>
-</p:properties>
-</file>
-
 <file path=customXml/item5.xml><?xml version="1.0" encoding="utf-8"?>
-<go:gDocsCustomXmlDataStorage xmlns:go="http://customooxmlschemas.google.com/" xmlns:r="http://schemas.openxmlformats.org/officeDocument/2006/relationships">
-  <go:docsCustomData xmlns:go="http://customooxmlschemas.google.com/" roundtripDataSignature="AMtx7mi9hMm1w2n+Vt6hN/m6X//z+ToJ7Q==">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</go:docsCustomData>
-</go:gDocsCustomXmlDataStorage>
+<?mso-contentType ?>
+<FormTemplates xmlns="http://schemas.microsoft.com/sharepoint/v3/contenttype/forms">
+  <Display>DocumentLibraryForm</Display>
+  <Edit>DocumentLibraryForm</Edit>
+  <New>DocumentLibraryForm</New>
+</FormTemplates>
 </file>
 
 <file path=customXml/itemProps1.xml><?xml version="1.0" encoding="utf-8"?>
@@ -13075,22 +13075,15 @@
 </file>
 
 <file path=customXml/itemProps2.xml><?xml version="1.0" encoding="utf-8"?>
-<ds:datastoreItem xmlns:ds="http://schemas.openxmlformats.org/officeDocument/2006/customXml" ds:itemID="{C680D73B-91EB-444F-9F20-EA16FB22928D}">
+<ds:datastoreItem xmlns:ds="http://schemas.openxmlformats.org/officeDocument/2006/customXml" ds:itemID="{11111111-1234-1234-1234-123412341234}">
   <ds:schemaRefs>
-    <ds:schemaRef ds:uri="http://schemas.microsoft.com/sharepoint/v3/contenttype/forms"/>
+    <ds:schemaRef ds:uri="http://customooxmlschemas.google.com/"/>
+    <ds:schemaRef ds:uri="http://schemas.openxmlformats.org/officeDocument/2006/relationships"/>
   </ds:schemaRefs>
 </ds:datastoreItem>
 </file>
 
 <file path=customXml/itemProps3.xml><?xml version="1.0" encoding="utf-8"?>
-<ds:datastoreItem xmlns:ds="http://schemas.openxmlformats.org/officeDocument/2006/customXml" ds:itemID="{119407D8-7FC4-47F1-85AD-0300064F059B}">
-  <ds:schemaRefs>
-    <ds:schemaRef ds:uri="http://schemas.openxmlformats.org/officeDocument/2006/bibliography"/>
-  </ds:schemaRefs>
-</ds:datastoreItem>
-</file>
-
-<file path=customXml/itemProps4.xml><?xml version="1.0" encoding="utf-8"?>
 <ds:datastoreItem xmlns:ds="http://schemas.openxmlformats.org/officeDocument/2006/customXml" ds:itemID="{6567523E-179E-43C2-932B-A043724ECE49}">
   <ds:schemaRefs>
     <ds:schemaRef ds:uri="http://schemas.microsoft.com/office/2006/metadata/properties"/>
@@ -13099,11 +13092,18 @@
 </ds:datastoreItem>
 </file>
 
+<file path=customXml/itemProps4.xml><?xml version="1.0" encoding="utf-8"?>
+<ds:datastoreItem xmlns:ds="http://schemas.openxmlformats.org/officeDocument/2006/customXml" ds:itemID="{119407D8-7FC4-47F1-85AD-0300064F059B}">
+  <ds:schemaRefs>
+    <ds:schemaRef ds:uri="http://schemas.openxmlformats.org/officeDocument/2006/bibliography"/>
+  </ds:schemaRefs>
+</ds:datastoreItem>
+</file>
+
 <file path=customXml/itemProps5.xml><?xml version="1.0" encoding="utf-8"?>
-<ds:datastoreItem xmlns:ds="http://schemas.openxmlformats.org/officeDocument/2006/customXml" ds:itemID="{11111111-1234-1234-1234-123412341234}">
+<ds:datastoreItem xmlns:ds="http://schemas.openxmlformats.org/officeDocument/2006/customXml" ds:itemID="{C680D73B-91EB-444F-9F20-EA16FB22928D}">
   <ds:schemaRefs>
-    <ds:schemaRef ds:uri="http://customooxmlschemas.google.com/"/>
-    <ds:schemaRef ds:uri="http://schemas.openxmlformats.org/officeDocument/2006/relationships"/>
+    <ds:schemaRef ds:uri="http://schemas.microsoft.com/sharepoint/v3/contenttype/forms"/>
   </ds:schemaRefs>
 </ds:datastoreItem>
 </file>

</xml_diff>